<commit_message>
docs: Update Ingredient and Menu.
</commit_message>
<xml_diff>
--- a/400 Hong Kong Dollar Ingredients 2.docx
+++ b/400 Hong Kong Dollar Ingredients 2.docx
@@ -764,6 +764,7 @@
     <w:p>
       <w:pPr>
         <w:numPr>
+          <w:ilvl w:val="0"/>
           <w:numId w:val="0"/>
         </w:numPr>
         <w:tabs>
@@ -781,6 +782,7 @@
     <w:p>
       <w:pPr>
         <w:numPr>
+          <w:ilvl w:val="0"/>
           <w:numId w:val="0"/>
         </w:numPr>
         <w:tabs>
@@ -843,6 +845,7 @@
     <w:p>
       <w:pPr>
         <w:numPr>
+          <w:ilvl w:val="0"/>
           <w:numId w:val="0"/>
         </w:numPr>
         <w:tabs>
@@ -948,6 +951,7 @@
     <w:p>
       <w:pPr>
         <w:numPr>
+          <w:ilvl w:val="0"/>
           <w:numId w:val="0"/>
         </w:numPr>
         <w:tabs>
@@ -965,6 +969,7 @@
     <w:p>
       <w:pPr>
         <w:numPr>
+          <w:ilvl w:val="0"/>
           <w:numId w:val="0"/>
         </w:numPr>
         <w:tabs>
@@ -1106,6 +1111,7 @@
     <w:p>
       <w:pPr>
         <w:numPr>
+          <w:ilvl w:val="0"/>
           <w:numId w:val="0"/>
         </w:numPr>
         <w:ind w:leftChars="0"/>
@@ -1726,9 +1732,128 @@
     </w:p>
     <w:p>
       <w:pPr>
+        <w:keepNext w:val="0"/>
+        <w:keepLines w:val="0"/>
+        <w:widowControl/>
         <w:numPr>
           <w:ilvl w:val="0"/>
           <w:numId w:val="5"/>
+        </w:numPr>
+        <w:suppressLineNumbers w:val="0"/>
+        <w:ind w:left="840" w:leftChars="0" w:hanging="420" w:firstLineChars="0"/>
+        <w:jc w:val="left"/>
+        <w:rPr>
+          <w:rFonts w:hint="default" w:ascii="Arial" w:hAnsi="Arial" w:cs="Arial"/>
+          <w:b w:val="0"/>
+          <w:bCs w:val="0"/>
+          <w:i w:val="0"/>
+          <w:iCs w:val="0"/>
+          <w:color w:val="auto"/>
+          <w:sz w:val="28"/>
+          <w:szCs w:val="28"/>
+          <w:lang w:val="en-US"/>
+        </w:rPr>
+      </w:pPr>
+      <w:r>
+        <w:rPr>
+          <w:rFonts w:hint="default" w:ascii="Arial" w:hAnsi="Arial" w:cs="Arial"/>
+          <w:b w:val="0"/>
+          <w:bCs w:val="0"/>
+          <w:i w:val="0"/>
+          <w:iCs w:val="0"/>
+          <w:color w:val="auto"/>
+          <w:sz w:val="28"/>
+          <w:szCs w:val="28"/>
+          <w:lang w:val="en-US"/>
+        </w:rPr>
+        <w:t xml:space="preserve">Self made Yougurt ~ With Yougurt maker </w:t>
+      </w:r>
+    </w:p>
+    <w:p>
+      <w:pPr>
+        <w:keepNext w:val="0"/>
+        <w:keepLines w:val="0"/>
+        <w:widowControl/>
+        <w:numPr>
+          <w:numId w:val="0"/>
+        </w:numPr>
+        <w:suppressLineNumbers w:val="0"/>
+        <w:ind w:firstLine="840" w:firstLineChars="300"/>
+        <w:jc w:val="left"/>
+        <w:rPr>
+          <w:rFonts w:hint="default" w:ascii="Arial" w:hAnsi="Arial" w:cs="Arial"/>
+          <w:b w:val="0"/>
+          <w:bCs w:val="0"/>
+          <w:i w:val="0"/>
+          <w:iCs w:val="0"/>
+          <w:color w:val="auto"/>
+          <w:sz w:val="28"/>
+          <w:szCs w:val="28"/>
+          <w:lang w:val="en-US"/>
+        </w:rPr>
+      </w:pPr>
+      <w:r>
+        <w:rPr>
+          <w:rFonts w:hint="default" w:ascii="Arial" w:hAnsi="Arial" w:cs="Arial"/>
+          <w:b w:val="0"/>
+          <w:bCs w:val="0"/>
+          <w:i w:val="0"/>
+          <w:iCs w:val="0"/>
+          <w:color w:val="auto"/>
+          <w:sz w:val="28"/>
+          <w:szCs w:val="28"/>
+          <w:lang w:val="en-US"/>
+        </w:rPr>
+        <w:t>(</w:t>
+      </w:r>
+      <w:r>
+        <w:rPr>
+          <w:rFonts w:hint="default" w:ascii="Arial" w:hAnsi="Arial" w:cs="Arial"/>
+          <w:b/>
+          <w:bCs/>
+          <w:i w:val="0"/>
+          <w:iCs w:val="0"/>
+          <w:color w:val="FF0000"/>
+          <w:sz w:val="28"/>
+          <w:szCs w:val="28"/>
+          <w:lang w:val="en-US"/>
+        </w:rPr>
+        <w:t xml:space="preserve">Don’t use </w:t>
+      </w:r>
+      <w:r>
+        <w:rPr>
+          <w:rFonts w:hint="default" w:ascii="Arial" w:hAnsi="Arial" w:cs="Arial" w:eastAsiaTheme="minorEastAsia"/>
+          <w:b/>
+          <w:bCs/>
+          <w:i w:val="0"/>
+          <w:iCs w:val="0"/>
+          <w:color w:val="FF0000"/>
+          <w:sz w:val="28"/>
+          <w:szCs w:val="28"/>
+          <w:lang w:val="en-US" w:eastAsia="zh-CN" w:bidi="ar-SA"/>
+        </w:rPr>
+        <w:t>久陽優格機 product defect</w:t>
+      </w:r>
+      <w:r>
+        <w:rPr>
+          <w:rFonts w:hint="default" w:ascii="Arial" w:hAnsi="Arial" w:cs="Arial" w:eastAsiaTheme="minorEastAsia"/>
+          <w:b w:val="0"/>
+          <w:bCs w:val="0"/>
+          <w:i w:val="0"/>
+          <w:iCs w:val="0"/>
+          <w:color w:val="auto"/>
+          <w:sz w:val="28"/>
+          <w:szCs w:val="28"/>
+          <w:lang w:val="en-US" w:eastAsia="zh-CN" w:bidi="ar-SA"/>
+        </w:rPr>
+        <w:t>)</w:t>
+      </w:r>
+    </w:p>
+    <w:p>
+      <w:pPr>
+        <w:numPr>
+          <w:ilvl w:val="0"/>
+          <w:numId w:val="6"/>
         </w:numPr>
         <w:wordWrap/>
         <w:ind w:left="840" w:leftChars="0" w:hanging="420" w:firstLineChars="0"/>
@@ -1755,16 +1880,73 @@
           <w:color w:val="auto"/>
           <w:sz w:val="28"/>
           <w:szCs w:val="28"/>
-          <w:lang w:val="en-US"/>
-        </w:rPr>
-        <w:t xml:space="preserve">Self made Yougurt ~ With Yougurt maker </w:t>
-      </w:r>
-    </w:p>
-    <w:p>
-      <w:pPr>
-        <w:numPr>
-          <w:ilvl w:val="0"/>
-          <w:numId w:val="5"/>
+          <w:lang w:val="en-US" w:eastAsia="zh-CN"/>
+        </w:rPr>
+        <w:t>Longevity Sweetened Milk (3.7 ml)</w:t>
+      </w:r>
+    </w:p>
+    <w:p>
+      <w:pPr>
+        <w:numPr>
+          <w:ilvl w:val="0"/>
+          <w:numId w:val="0"/>
+        </w:numPr>
+        <w:wordWrap/>
+        <w:jc w:val="left"/>
+        <w:rPr>
+          <w:rFonts w:hint="default" w:ascii="Arial" w:hAnsi="Arial" w:cs="Arial"/>
+          <w:b w:val="0"/>
+          <w:bCs w:val="0"/>
+          <w:i w:val="0"/>
+          <w:iCs w:val="0"/>
+          <w:color w:val="auto"/>
+          <w:sz w:val="28"/>
+          <w:szCs w:val="28"/>
+          <w:lang w:val="en-US"/>
+        </w:rPr>
+      </w:pPr>
+    </w:p>
+    <w:p>
+      <w:pPr>
+        <w:numPr>
+          <w:ilvl w:val="0"/>
+          <w:numId w:val="7"/>
+        </w:numPr>
+        <w:wordWrap/>
+        <w:ind w:left="420" w:leftChars="0" w:hanging="420" w:firstLineChars="0"/>
+        <w:jc w:val="left"/>
+        <w:rPr>
+          <w:rFonts w:hint="default" w:ascii="Arial" w:hAnsi="Arial" w:cs="Arial"/>
+          <w:b w:val="0"/>
+          <w:bCs w:val="0"/>
+          <w:i w:val="0"/>
+          <w:iCs w:val="0"/>
+          <w:color w:val="auto"/>
+          <w:sz w:val="28"/>
+          <w:szCs w:val="28"/>
+          <w:lang w:val="en-US"/>
+        </w:rPr>
+      </w:pPr>
+      <w:r>
+        <w:rPr>
+          <w:rFonts w:hint="default" w:ascii="Arial" w:hAnsi="Arial" w:cs="Arial"/>
+          <w:b w:val="0"/>
+          <w:bCs w:val="0"/>
+          <w:i w:val="0"/>
+          <w:iCs w:val="0"/>
+          <w:color w:val="auto"/>
+          <w:sz w:val="28"/>
+          <w:szCs w:val="28"/>
+          <w:lang w:val="en-US"/>
+        </w:rPr>
+        <w:t>Lunch</w:t>
+      </w:r>
+    </w:p>
+    <w:p>
+      <w:pPr>
+        <w:numPr>
+          <w:ilvl w:val="1"/>
+          <w:numId w:val="7"/>
         </w:numPr>
         <w:wordWrap/>
         <w:ind w:left="840" w:leftChars="0" w:hanging="420" w:firstLineChars="0"/>
@@ -1791,14 +1973,275 @@
           <w:color w:val="auto"/>
           <w:sz w:val="28"/>
           <w:szCs w:val="28"/>
-          <w:lang w:val="en-US" w:eastAsia="zh-CN"/>
-        </w:rPr>
-        <w:t>Longevity Sweetened Milk (3.7 ml)</w:t>
-      </w:r>
-    </w:p>
-    <w:p>
-      <w:pPr>
-        <w:numPr>
+          <w:lang w:val="en-US"/>
+        </w:rPr>
+        <w:t>Meat Raw ~ 81 gram</w:t>
+      </w:r>
+      <w:bookmarkStart w:id="0" w:name="_GoBack"/>
+      <w:bookmarkEnd w:id="0"/>
+    </w:p>
+    <w:p>
+      <w:pPr>
+        <w:numPr>
+          <w:ilvl w:val="1"/>
+          <w:numId w:val="7"/>
+        </w:numPr>
+        <w:wordWrap/>
+        <w:ind w:left="840" w:leftChars="0" w:hanging="420" w:firstLineChars="0"/>
+        <w:jc w:val="left"/>
+        <w:rPr>
+          <w:rFonts w:hint="default" w:ascii="Arial" w:hAnsi="Arial" w:cs="Arial"/>
+          <w:b w:val="0"/>
+          <w:bCs w:val="0"/>
+          <w:i w:val="0"/>
+          <w:iCs w:val="0"/>
+          <w:color w:val="auto"/>
+          <w:sz w:val="28"/>
+          <w:szCs w:val="28"/>
+          <w:lang w:val="en-US"/>
+        </w:rPr>
+      </w:pPr>
+      <w:r>
+        <w:rPr>
+          <w:rFonts w:hint="default" w:ascii="Arial" w:hAnsi="Arial" w:cs="Arial"/>
+          <w:b w:val="0"/>
+          <w:bCs w:val="0"/>
+          <w:i w:val="0"/>
+          <w:iCs w:val="0"/>
+          <w:color w:val="auto"/>
+          <w:sz w:val="28"/>
+          <w:szCs w:val="28"/>
+          <w:lang w:val="en-US"/>
+        </w:rPr>
+        <w:t>Vegetable ~ 83.33 gram</w:t>
+      </w:r>
+    </w:p>
+    <w:p>
+      <w:pPr>
+        <w:numPr>
+          <w:ilvl w:val="1"/>
+          <w:numId w:val="7"/>
+        </w:numPr>
+        <w:wordWrap/>
+        <w:ind w:left="840" w:leftChars="0" w:hanging="420" w:firstLineChars="0"/>
+        <w:jc w:val="left"/>
+        <w:rPr>
+          <w:rFonts w:hint="default" w:ascii="Arial" w:hAnsi="Arial" w:cs="Arial"/>
+          <w:b w:val="0"/>
+          <w:bCs w:val="0"/>
+          <w:i w:val="0"/>
+          <w:iCs w:val="0"/>
+          <w:color w:val="auto"/>
+          <w:sz w:val="28"/>
+          <w:szCs w:val="28"/>
+          <w:lang w:val="en-US"/>
+        </w:rPr>
+      </w:pPr>
+      <w:r>
+        <w:rPr>
+          <w:rFonts w:hint="default" w:ascii="Arial" w:hAnsi="Arial" w:cs="Arial"/>
+          <w:b w:val="0"/>
+          <w:bCs w:val="0"/>
+          <w:i w:val="0"/>
+          <w:iCs w:val="0"/>
+          <w:color w:val="auto"/>
+          <w:sz w:val="28"/>
+          <w:szCs w:val="28"/>
+          <w:lang w:val="en-US"/>
+        </w:rPr>
+        <w:t>Rice ~ 125 gram</w:t>
+      </w:r>
+    </w:p>
+    <w:p>
+      <w:pPr>
+        <w:numPr>
+          <w:ilvl w:val="2"/>
+          <w:numId w:val="7"/>
+        </w:numPr>
+        <w:wordWrap/>
+        <w:ind w:left="1260" w:leftChars="0" w:hanging="420" w:firstLineChars="0"/>
+        <w:jc w:val="left"/>
+        <w:rPr>
+          <w:rFonts w:hint="default" w:ascii="Arial" w:hAnsi="Arial" w:cs="Arial"/>
+          <w:b w:val="0"/>
+          <w:bCs w:val="0"/>
+          <w:i w:val="0"/>
+          <w:iCs w:val="0"/>
+          <w:color w:val="auto"/>
+          <w:sz w:val="28"/>
+          <w:szCs w:val="28"/>
+          <w:lang w:val="en-US"/>
+        </w:rPr>
+      </w:pPr>
+      <w:r>
+        <w:rPr>
+          <w:rFonts w:hint="default" w:ascii="Arial" w:hAnsi="Arial" w:cs="Arial"/>
+          <w:b w:val="0"/>
+          <w:bCs w:val="0"/>
+          <w:i w:val="0"/>
+          <w:iCs w:val="0"/>
+          <w:color w:val="auto"/>
+          <w:sz w:val="28"/>
+          <w:szCs w:val="28"/>
+          <w:lang w:val="en-US"/>
+        </w:rPr>
+        <w:t xml:space="preserve">Add water to the pot </w:t>
+      </w:r>
+    </w:p>
+    <w:p>
+      <w:pPr>
+        <w:numPr>
+          <w:ilvl w:val="2"/>
+          <w:numId w:val="7"/>
+        </w:numPr>
+        <w:wordWrap/>
+        <w:ind w:left="1260" w:leftChars="0" w:hanging="420" w:firstLineChars="0"/>
+        <w:jc w:val="left"/>
+        <w:rPr>
+          <w:rFonts w:hint="default" w:ascii="Arial" w:hAnsi="Arial" w:cs="Arial"/>
+          <w:b w:val="0"/>
+          <w:bCs w:val="0"/>
+          <w:i w:val="0"/>
+          <w:iCs w:val="0"/>
+          <w:color w:val="auto"/>
+          <w:sz w:val="28"/>
+          <w:szCs w:val="28"/>
+          <w:lang w:val="en-US"/>
+        </w:rPr>
+      </w:pPr>
+      <w:r>
+        <w:rPr>
+          <w:rFonts w:hint="default" w:ascii="Arial" w:hAnsi="Arial" w:cs="Arial"/>
+          <w:b w:val="0"/>
+          <w:bCs w:val="0"/>
+          <w:i w:val="0"/>
+          <w:iCs w:val="0"/>
+          <w:color w:val="auto"/>
+          <w:sz w:val="28"/>
+          <w:szCs w:val="28"/>
+          <w:lang w:val="en-US"/>
+        </w:rPr>
+        <w:t>Add meat (</w:t>
+      </w:r>
+      <w:r>
+        <w:rPr>
+          <w:rFonts w:hint="default" w:ascii="Arial" w:hAnsi="Arial" w:cs="Arial" w:eastAsiaTheme="minorEastAsia"/>
+          <w:b w:val="0"/>
+          <w:bCs w:val="0"/>
+          <w:i w:val="0"/>
+          <w:iCs w:val="0"/>
+          <w:color w:val="auto"/>
+          <w:sz w:val="28"/>
+          <w:szCs w:val="28"/>
+          <w:lang w:val="en-US" w:eastAsia="zh-CN" w:bidi="ar-SA"/>
+        </w:rPr>
+        <w:t>Marinated</w:t>
+      </w:r>
+      <w:r>
+        <w:rPr>
+          <w:rFonts w:hint="default" w:ascii="Arial" w:hAnsi="Arial" w:cs="Arial"/>
+          <w:b w:val="0"/>
+          <w:bCs w:val="0"/>
+          <w:i w:val="0"/>
+          <w:iCs w:val="0"/>
+          <w:color w:val="auto"/>
+          <w:sz w:val="28"/>
+          <w:szCs w:val="28"/>
+          <w:lang w:val="en-US" w:eastAsia="zh-CN" w:bidi="ar-SA"/>
+        </w:rPr>
+        <w:t xml:space="preserve"> with salt) </w:t>
+      </w:r>
+      <w:r>
+        <w:rPr>
+          <w:rFonts w:hint="default" w:ascii="Arial" w:hAnsi="Arial" w:cs="Arial"/>
+          <w:b w:val="0"/>
+          <w:bCs w:val="0"/>
+          <w:i w:val="0"/>
+          <w:iCs w:val="0"/>
+          <w:color w:val="auto"/>
+          <w:sz w:val="28"/>
+          <w:szCs w:val="28"/>
+          <w:lang w:val="en-US"/>
+        </w:rPr>
+        <w:t xml:space="preserve">and vegetable when the water is fully boiled. </w:t>
+      </w:r>
+    </w:p>
+    <w:p>
+      <w:pPr>
+        <w:numPr>
+          <w:ilvl w:val="2"/>
+          <w:numId w:val="7"/>
+        </w:numPr>
+        <w:wordWrap/>
+        <w:ind w:left="1260" w:leftChars="0" w:hanging="420" w:firstLineChars="0"/>
+        <w:jc w:val="left"/>
+        <w:rPr>
+          <w:rFonts w:hint="default" w:ascii="Arial" w:hAnsi="Arial" w:cs="Arial"/>
+          <w:b w:val="0"/>
+          <w:bCs w:val="0"/>
+          <w:i w:val="0"/>
+          <w:iCs w:val="0"/>
+          <w:color w:val="auto"/>
+          <w:sz w:val="28"/>
+          <w:szCs w:val="28"/>
+          <w:lang w:val="en-US"/>
+        </w:rPr>
+      </w:pPr>
+      <w:r>
+        <w:rPr>
+          <w:rFonts w:hint="default" w:ascii="Arial" w:hAnsi="Arial" w:cs="Arial"/>
+          <w:b w:val="0"/>
+          <w:bCs w:val="0"/>
+          <w:i w:val="0"/>
+          <w:iCs w:val="0"/>
+          <w:color w:val="auto"/>
+          <w:sz w:val="28"/>
+          <w:szCs w:val="28"/>
+          <w:lang w:val="en-US"/>
+        </w:rPr>
+        <w:t>Wash the rice and steam the rice.</w:t>
+      </w:r>
+    </w:p>
+    <w:p>
+      <w:pPr>
+        <w:numPr>
+          <w:ilvl w:val="2"/>
+          <w:numId w:val="7"/>
+        </w:numPr>
+        <w:wordWrap/>
+        <w:ind w:left="1260" w:leftChars="0" w:hanging="420" w:firstLineChars="0"/>
+        <w:jc w:val="left"/>
+        <w:rPr>
+          <w:rFonts w:hint="default" w:ascii="Arial" w:hAnsi="Arial" w:cs="Arial"/>
+          <w:b w:val="0"/>
+          <w:bCs w:val="0"/>
+          <w:i w:val="0"/>
+          <w:iCs w:val="0"/>
+          <w:color w:val="auto"/>
+          <w:sz w:val="28"/>
+          <w:szCs w:val="28"/>
+          <w:lang w:val="en-US"/>
+        </w:rPr>
+      </w:pPr>
+      <w:r>
+        <w:rPr>
+          <w:rFonts w:hint="default" w:ascii="Arial" w:hAnsi="Arial" w:cs="Arial"/>
+          <w:b w:val="0"/>
+          <w:bCs w:val="0"/>
+          <w:i w:val="0"/>
+          <w:iCs w:val="0"/>
+          <w:color w:val="auto"/>
+          <w:sz w:val="28"/>
+          <w:szCs w:val="28"/>
+          <w:lang w:val="en-US"/>
+        </w:rPr>
+        <w:t>Served.</w:t>
+      </w:r>
+    </w:p>
+    <w:p>
+      <w:pPr>
+        <w:numPr>
+          <w:ilvl w:val="0"/>
           <w:numId w:val="0"/>
         </w:numPr>
         <w:wordWrap/>
@@ -1820,7 +2263,7 @@
       <w:pPr>
         <w:numPr>
           <w:ilvl w:val="0"/>
-          <w:numId w:val="6"/>
+          <w:numId w:val="4"/>
         </w:numPr>
         <w:wordWrap/>
         <w:ind w:left="420" w:leftChars="0" w:hanging="420" w:firstLineChars="0"/>
@@ -1849,13 +2292,13 @@
           <w:szCs w:val="28"/>
           <w:lang w:val="en-US"/>
         </w:rPr>
-        <w:t>Lunch</w:t>
-      </w:r>
-    </w:p>
-    <w:p>
-      <w:pPr>
-        <w:numPr>
-          <w:ilvl w:val="1"/>
+        <w:t>Afternoon Snacks</w:t>
+      </w:r>
+    </w:p>
+    <w:p>
+      <w:pPr>
+        <w:numPr>
+          <w:ilvl w:val="0"/>
           <w:numId w:val="6"/>
         </w:numPr>
         <w:wordWrap/>
@@ -1885,13 +2328,94 @@
           <w:szCs w:val="28"/>
           <w:lang w:val="en-US"/>
         </w:rPr>
-        <w:t>Meat Raw ~ 81 gram</w:t>
-      </w:r>
-    </w:p>
-    <w:p>
-      <w:pPr>
-        <w:numPr>
-          <w:ilvl w:val="1"/>
+        <w:t>Self made Yougurt ~ With Yougurt maker</w:t>
+      </w:r>
+    </w:p>
+    <w:p>
+      <w:pPr>
+        <w:keepNext w:val="0"/>
+        <w:keepLines w:val="0"/>
+        <w:widowControl/>
+        <w:numPr>
+          <w:ilvl w:val="0"/>
+          <w:numId w:val="0"/>
+        </w:numPr>
+        <w:suppressLineNumbers w:val="0"/>
+        <w:ind w:firstLine="840" w:firstLineChars="300"/>
+        <w:jc w:val="left"/>
+        <w:rPr>
+          <w:rFonts w:hint="default" w:ascii="Arial" w:hAnsi="Arial" w:cs="Arial"/>
+          <w:b w:val="0"/>
+          <w:bCs w:val="0"/>
+          <w:i w:val="0"/>
+          <w:iCs w:val="0"/>
+          <w:color w:val="auto"/>
+          <w:sz w:val="28"/>
+          <w:szCs w:val="28"/>
+          <w:lang w:val="en-US"/>
+        </w:rPr>
+      </w:pPr>
+      <w:r>
+        <w:rPr>
+          <w:rFonts w:hint="default" w:ascii="Arial" w:hAnsi="Arial" w:cs="Arial"/>
+          <w:b w:val="0"/>
+          <w:bCs w:val="0"/>
+          <w:i w:val="0"/>
+          <w:iCs w:val="0"/>
+          <w:color w:val="auto"/>
+          <w:sz w:val="28"/>
+          <w:szCs w:val="28"/>
+          <w:lang w:val="en-US"/>
+        </w:rPr>
+        <w:t>(</w:t>
+      </w:r>
+      <w:r>
+        <w:rPr>
+          <w:rFonts w:hint="default" w:ascii="Arial" w:hAnsi="Arial" w:cs="Arial"/>
+          <w:b/>
+          <w:bCs/>
+          <w:i w:val="0"/>
+          <w:iCs w:val="0"/>
+          <w:color w:val="FF0000"/>
+          <w:sz w:val="28"/>
+          <w:szCs w:val="28"/>
+          <w:lang w:val="en-US"/>
+        </w:rPr>
+        <w:t xml:space="preserve">Don’t use </w:t>
+      </w:r>
+      <w:r>
+        <w:rPr>
+          <w:rFonts w:hint="default" w:ascii="Arial" w:hAnsi="Arial" w:cs="Arial" w:eastAsiaTheme="minorEastAsia"/>
+          <w:b/>
+          <w:bCs/>
+          <w:i w:val="0"/>
+          <w:iCs w:val="0"/>
+          <w:color w:val="FF0000"/>
+          <w:sz w:val="28"/>
+          <w:szCs w:val="28"/>
+          <w:lang w:val="en-US" w:eastAsia="zh-CN" w:bidi="ar-SA"/>
+        </w:rPr>
+        <w:t>久陽優格機 product defect</w:t>
+      </w:r>
+      <w:r>
+        <w:rPr>
+          <w:rFonts w:hint="default" w:ascii="Arial" w:hAnsi="Arial" w:cs="Arial" w:eastAsiaTheme="minorEastAsia"/>
+          <w:b w:val="0"/>
+          <w:bCs w:val="0"/>
+          <w:i w:val="0"/>
+          <w:iCs w:val="0"/>
+          <w:color w:val="auto"/>
+          <w:sz w:val="28"/>
+          <w:szCs w:val="28"/>
+          <w:lang w:val="en-US" w:eastAsia="zh-CN" w:bidi="ar-SA"/>
+        </w:rPr>
+        <w:t>)</w:t>
+      </w:r>
+    </w:p>
+    <w:p>
+      <w:pPr>
+        <w:numPr>
+          <w:ilvl w:val="0"/>
           <w:numId w:val="6"/>
         </w:numPr>
         <w:wordWrap/>
@@ -1919,373 +2443,6 @@
           <w:color w:val="auto"/>
           <w:sz w:val="28"/>
           <w:szCs w:val="28"/>
-          <w:lang w:val="en-US"/>
-        </w:rPr>
-        <w:t>Vegetable ~ 83.33 gram</w:t>
-      </w:r>
-    </w:p>
-    <w:p>
-      <w:pPr>
-        <w:numPr>
-          <w:ilvl w:val="1"/>
-          <w:numId w:val="6"/>
-        </w:numPr>
-        <w:wordWrap/>
-        <w:ind w:left="840" w:leftChars="0" w:hanging="420" w:firstLineChars="0"/>
-        <w:jc w:val="left"/>
-        <w:rPr>
-          <w:rFonts w:hint="default" w:ascii="Arial" w:hAnsi="Arial" w:cs="Arial"/>
-          <w:b w:val="0"/>
-          <w:bCs w:val="0"/>
-          <w:i w:val="0"/>
-          <w:iCs w:val="0"/>
-          <w:color w:val="auto"/>
-          <w:sz w:val="28"/>
-          <w:szCs w:val="28"/>
-          <w:lang w:val="en-US"/>
-        </w:rPr>
-      </w:pPr>
-      <w:r>
-        <w:rPr>
-          <w:rFonts w:hint="default" w:ascii="Arial" w:hAnsi="Arial" w:cs="Arial"/>
-          <w:b w:val="0"/>
-          <w:bCs w:val="0"/>
-          <w:i w:val="0"/>
-          <w:iCs w:val="0"/>
-          <w:color w:val="auto"/>
-          <w:sz w:val="28"/>
-          <w:szCs w:val="28"/>
-          <w:lang w:val="en-US"/>
-        </w:rPr>
-        <w:t>Rice ~ 125 gram</w:t>
-      </w:r>
-    </w:p>
-    <w:p>
-      <w:pPr>
-        <w:numPr>
-          <w:ilvl w:val="2"/>
-          <w:numId w:val="6"/>
-        </w:numPr>
-        <w:wordWrap/>
-        <w:ind w:left="1260" w:leftChars="0" w:hanging="420" w:firstLineChars="0"/>
-        <w:jc w:val="left"/>
-        <w:rPr>
-          <w:rFonts w:hint="default" w:ascii="Arial" w:hAnsi="Arial" w:cs="Arial"/>
-          <w:b w:val="0"/>
-          <w:bCs w:val="0"/>
-          <w:i w:val="0"/>
-          <w:iCs w:val="0"/>
-          <w:color w:val="auto"/>
-          <w:sz w:val="28"/>
-          <w:szCs w:val="28"/>
-          <w:lang w:val="en-US"/>
-        </w:rPr>
-      </w:pPr>
-      <w:r>
-        <w:rPr>
-          <w:rFonts w:hint="default" w:ascii="Arial" w:hAnsi="Arial" w:cs="Arial"/>
-          <w:b w:val="0"/>
-          <w:bCs w:val="0"/>
-          <w:i w:val="0"/>
-          <w:iCs w:val="0"/>
-          <w:color w:val="auto"/>
-          <w:sz w:val="28"/>
-          <w:szCs w:val="28"/>
-          <w:lang w:val="en-US"/>
-        </w:rPr>
-        <w:t xml:space="preserve">Add water to the pot </w:t>
-      </w:r>
-    </w:p>
-    <w:p>
-      <w:pPr>
-        <w:numPr>
-          <w:ilvl w:val="2"/>
-          <w:numId w:val="6"/>
-        </w:numPr>
-        <w:wordWrap/>
-        <w:ind w:left="1260" w:leftChars="0" w:hanging="420" w:firstLineChars="0"/>
-        <w:jc w:val="left"/>
-        <w:rPr>
-          <w:rFonts w:hint="default" w:ascii="Arial" w:hAnsi="Arial" w:cs="Arial"/>
-          <w:b w:val="0"/>
-          <w:bCs w:val="0"/>
-          <w:i w:val="0"/>
-          <w:iCs w:val="0"/>
-          <w:color w:val="auto"/>
-          <w:sz w:val="28"/>
-          <w:szCs w:val="28"/>
-          <w:lang w:val="en-US"/>
-        </w:rPr>
-      </w:pPr>
-      <w:r>
-        <w:rPr>
-          <w:rFonts w:hint="default" w:ascii="Arial" w:hAnsi="Arial" w:cs="Arial"/>
-          <w:b w:val="0"/>
-          <w:bCs w:val="0"/>
-          <w:i w:val="0"/>
-          <w:iCs w:val="0"/>
-          <w:color w:val="auto"/>
-          <w:sz w:val="28"/>
-          <w:szCs w:val="28"/>
-          <w:lang w:val="en-US"/>
-        </w:rPr>
-        <w:t>Add meat (</w:t>
-      </w:r>
-      <w:r>
-        <w:rPr>
-          <w:rFonts w:hint="default" w:ascii="Arial" w:hAnsi="Arial" w:cs="Arial" w:eastAsiaTheme="minorEastAsia"/>
-          <w:b w:val="0"/>
-          <w:bCs w:val="0"/>
-          <w:i w:val="0"/>
-          <w:iCs w:val="0"/>
-          <w:color w:val="auto"/>
-          <w:sz w:val="28"/>
-          <w:szCs w:val="28"/>
-          <w:lang w:val="en-US" w:eastAsia="zh-CN" w:bidi="ar-SA"/>
-        </w:rPr>
-        <w:t>Marinated</w:t>
-      </w:r>
-      <w:r>
-        <w:rPr>
-          <w:rFonts w:hint="default" w:ascii="Arial" w:hAnsi="Arial" w:cs="Arial"/>
-          <w:b w:val="0"/>
-          <w:bCs w:val="0"/>
-          <w:i w:val="0"/>
-          <w:iCs w:val="0"/>
-          <w:color w:val="auto"/>
-          <w:sz w:val="28"/>
-          <w:szCs w:val="28"/>
-          <w:lang w:val="en-US" w:eastAsia="zh-CN" w:bidi="ar-SA"/>
-        </w:rPr>
-        <w:t xml:space="preserve"> with salt) </w:t>
-      </w:r>
-      <w:r>
-        <w:rPr>
-          <w:rFonts w:hint="default" w:ascii="Arial" w:hAnsi="Arial" w:cs="Arial"/>
-          <w:b w:val="0"/>
-          <w:bCs w:val="0"/>
-          <w:i w:val="0"/>
-          <w:iCs w:val="0"/>
-          <w:color w:val="auto"/>
-          <w:sz w:val="28"/>
-          <w:szCs w:val="28"/>
-          <w:lang w:val="en-US"/>
-        </w:rPr>
-        <w:t xml:space="preserve">and vegetable when the water is fully boiled. </w:t>
-      </w:r>
-    </w:p>
-    <w:p>
-      <w:pPr>
-        <w:numPr>
-          <w:ilvl w:val="2"/>
-          <w:numId w:val="6"/>
-        </w:numPr>
-        <w:wordWrap/>
-        <w:ind w:left="1260" w:leftChars="0" w:hanging="420" w:firstLineChars="0"/>
-        <w:jc w:val="left"/>
-        <w:rPr>
-          <w:rFonts w:hint="default" w:ascii="Arial" w:hAnsi="Arial" w:cs="Arial"/>
-          <w:b w:val="0"/>
-          <w:bCs w:val="0"/>
-          <w:i w:val="0"/>
-          <w:iCs w:val="0"/>
-          <w:color w:val="auto"/>
-          <w:sz w:val="28"/>
-          <w:szCs w:val="28"/>
-          <w:lang w:val="en-US"/>
-        </w:rPr>
-      </w:pPr>
-      <w:r>
-        <w:rPr>
-          <w:rFonts w:hint="default" w:ascii="Arial" w:hAnsi="Arial" w:cs="Arial"/>
-          <w:b w:val="0"/>
-          <w:bCs w:val="0"/>
-          <w:i w:val="0"/>
-          <w:iCs w:val="0"/>
-          <w:color w:val="auto"/>
-          <w:sz w:val="28"/>
-          <w:szCs w:val="28"/>
-          <w:lang w:val="en-US"/>
-        </w:rPr>
-        <w:t>Wash the rice and steam the rice.</w:t>
-      </w:r>
-    </w:p>
-    <w:p>
-      <w:pPr>
-        <w:numPr>
-          <w:ilvl w:val="2"/>
-          <w:numId w:val="6"/>
-        </w:numPr>
-        <w:wordWrap/>
-        <w:ind w:left="1260" w:leftChars="0" w:hanging="420" w:firstLineChars="0"/>
-        <w:jc w:val="left"/>
-        <w:rPr>
-          <w:rFonts w:hint="default" w:ascii="Arial" w:hAnsi="Arial" w:cs="Arial"/>
-          <w:b w:val="0"/>
-          <w:bCs w:val="0"/>
-          <w:i w:val="0"/>
-          <w:iCs w:val="0"/>
-          <w:color w:val="auto"/>
-          <w:sz w:val="28"/>
-          <w:szCs w:val="28"/>
-          <w:lang w:val="en-US"/>
-        </w:rPr>
-      </w:pPr>
-      <w:r>
-        <w:rPr>
-          <w:rFonts w:hint="default" w:ascii="Arial" w:hAnsi="Arial" w:cs="Arial"/>
-          <w:b w:val="0"/>
-          <w:bCs w:val="0"/>
-          <w:i w:val="0"/>
-          <w:iCs w:val="0"/>
-          <w:color w:val="auto"/>
-          <w:sz w:val="28"/>
-          <w:szCs w:val="28"/>
-          <w:lang w:val="en-US"/>
-        </w:rPr>
-        <w:t>Served.</w:t>
-      </w:r>
-    </w:p>
-    <w:p>
-      <w:pPr>
-        <w:numPr>
-          <w:ilvl w:val="0"/>
-          <w:numId w:val="0"/>
-        </w:numPr>
-        <w:wordWrap/>
-        <w:jc w:val="left"/>
-        <w:rPr>
-          <w:rFonts w:hint="default" w:ascii="Arial" w:hAnsi="Arial" w:cs="Arial"/>
-          <w:b w:val="0"/>
-          <w:bCs w:val="0"/>
-          <w:i w:val="0"/>
-          <w:iCs w:val="0"/>
-          <w:color w:val="auto"/>
-          <w:sz w:val="28"/>
-          <w:szCs w:val="28"/>
-          <w:lang w:val="en-US"/>
-        </w:rPr>
-      </w:pPr>
-    </w:p>
-    <w:p>
-      <w:pPr>
-        <w:numPr>
-          <w:ilvl w:val="0"/>
-          <w:numId w:val="4"/>
-        </w:numPr>
-        <w:wordWrap/>
-        <w:ind w:left="420" w:leftChars="0" w:hanging="420" w:firstLineChars="0"/>
-        <w:jc w:val="left"/>
-        <w:rPr>
-          <w:rFonts w:hint="default" w:ascii="Arial" w:hAnsi="Arial" w:cs="Arial"/>
-          <w:b w:val="0"/>
-          <w:bCs w:val="0"/>
-          <w:i w:val="0"/>
-          <w:iCs w:val="0"/>
-          <w:color w:val="auto"/>
-          <w:sz w:val="28"/>
-          <w:szCs w:val="28"/>
-          <w:lang w:val="en-US"/>
-        </w:rPr>
-      </w:pPr>
-      <w:r>
-        <w:rPr>
-          <w:rFonts w:hint="default" w:ascii="Arial" w:hAnsi="Arial" w:cs="Arial"/>
-          <w:b w:val="0"/>
-          <w:bCs w:val="0"/>
-          <w:i w:val="0"/>
-          <w:iCs w:val="0"/>
-          <w:color w:val="auto"/>
-          <w:sz w:val="28"/>
-          <w:szCs w:val="28"/>
-          <w:lang w:val="en-US"/>
-        </w:rPr>
-        <w:t>Afternoon Snacks</w:t>
-      </w:r>
-    </w:p>
-    <w:p>
-      <w:pPr>
-        <w:numPr>
-          <w:ilvl w:val="0"/>
-          <w:numId w:val="5"/>
-        </w:numPr>
-        <w:wordWrap/>
-        <w:ind w:left="840" w:leftChars="0" w:hanging="420" w:firstLineChars="0"/>
-        <w:jc w:val="left"/>
-        <w:rPr>
-          <w:rFonts w:hint="default" w:ascii="Arial" w:hAnsi="Arial" w:cs="Arial"/>
-          <w:b w:val="0"/>
-          <w:bCs w:val="0"/>
-          <w:i w:val="0"/>
-          <w:iCs w:val="0"/>
-          <w:color w:val="auto"/>
-          <w:sz w:val="28"/>
-          <w:szCs w:val="28"/>
-          <w:lang w:val="en-US"/>
-        </w:rPr>
-      </w:pPr>
-      <w:r>
-        <w:rPr>
-          <w:rFonts w:hint="default" w:ascii="Arial" w:hAnsi="Arial" w:cs="Arial"/>
-          <w:b w:val="0"/>
-          <w:bCs w:val="0"/>
-          <w:i w:val="0"/>
-          <w:iCs w:val="0"/>
-          <w:color w:val="auto"/>
-          <w:sz w:val="28"/>
-          <w:szCs w:val="28"/>
-          <w:lang w:val="en-US"/>
-        </w:rPr>
-        <w:t xml:space="preserve">Self made Yougurt ~ With Yougurt maker </w:t>
-      </w:r>
-      <w:bookmarkStart w:id="0" w:name="_GoBack"/>
-      <w:bookmarkEnd w:id="0"/>
-      <w:r>
-        <w:rPr>
-          <w:rFonts w:hint="default" w:ascii="Arial" w:hAnsi="Arial" w:cs="Arial"/>
-          <w:b w:val="0"/>
-          <w:bCs w:val="0"/>
-          <w:i w:val="0"/>
-          <w:iCs w:val="0"/>
-          <w:color w:val="auto"/>
-          <w:sz w:val="28"/>
-          <w:szCs w:val="28"/>
-          <w:lang w:val="en-US"/>
-        </w:rPr>
-        <w:t xml:space="preserve"> </w:t>
-      </w:r>
-    </w:p>
-    <w:p>
-      <w:pPr>
-        <w:numPr>
-          <w:ilvl w:val="0"/>
-          <w:numId w:val="5"/>
-        </w:numPr>
-        <w:wordWrap/>
-        <w:ind w:left="840" w:leftChars="0" w:hanging="420" w:firstLineChars="0"/>
-        <w:jc w:val="left"/>
-        <w:rPr>
-          <w:rFonts w:hint="default" w:ascii="Arial" w:hAnsi="Arial" w:cs="Arial"/>
-          <w:b w:val="0"/>
-          <w:bCs w:val="0"/>
-          <w:i w:val="0"/>
-          <w:iCs w:val="0"/>
-          <w:color w:val="auto"/>
-          <w:sz w:val="28"/>
-          <w:szCs w:val="28"/>
-          <w:lang w:val="en-US"/>
-        </w:rPr>
-      </w:pPr>
-      <w:r>
-        <w:rPr>
-          <w:rFonts w:hint="default" w:ascii="Arial" w:hAnsi="Arial" w:cs="Arial"/>
-          <w:b w:val="0"/>
-          <w:bCs w:val="0"/>
-          <w:i w:val="0"/>
-          <w:iCs w:val="0"/>
-          <w:color w:val="auto"/>
-          <w:sz w:val="28"/>
-          <w:szCs w:val="28"/>
           <w:lang w:val="en-US" w:eastAsia="zh-CN"/>
         </w:rPr>
         <w:t>Longevity Sweetened Milk</w:t>
@@ -2308,6 +2465,7 @@
     <w:p>
       <w:pPr>
         <w:numPr>
+          <w:ilvl w:val="0"/>
           <w:numId w:val="0"/>
         </w:numPr>
         <w:tabs>
@@ -2332,7 +2490,7 @@
       <w:pPr>
         <w:numPr>
           <w:ilvl w:val="0"/>
-          <w:numId w:val="6"/>
+          <w:numId w:val="7"/>
         </w:numPr>
         <w:wordWrap/>
         <w:ind w:left="420" w:leftChars="0" w:hanging="420" w:firstLineChars="0"/>
@@ -2368,7 +2526,7 @@
       <w:pPr>
         <w:numPr>
           <w:ilvl w:val="1"/>
-          <w:numId w:val="6"/>
+          <w:numId w:val="7"/>
         </w:numPr>
         <w:wordWrap/>
         <w:ind w:left="840" w:leftChars="0" w:hanging="420" w:firstLineChars="0"/>
@@ -2404,7 +2562,7 @@
       <w:pPr>
         <w:numPr>
           <w:ilvl w:val="1"/>
-          <w:numId w:val="6"/>
+          <w:numId w:val="7"/>
         </w:numPr>
         <w:wordWrap/>
         <w:ind w:left="840" w:leftChars="0" w:hanging="420" w:firstLineChars="0"/>
@@ -2440,7 +2598,7 @@
       <w:pPr>
         <w:numPr>
           <w:ilvl w:val="1"/>
-          <w:numId w:val="6"/>
+          <w:numId w:val="7"/>
         </w:numPr>
         <w:wordWrap/>
         <w:ind w:left="840" w:leftChars="0" w:hanging="420" w:firstLineChars="0"/>
@@ -2476,7 +2634,7 @@
       <w:pPr>
         <w:numPr>
           <w:ilvl w:val="2"/>
-          <w:numId w:val="6"/>
+          <w:numId w:val="7"/>
         </w:numPr>
         <w:wordWrap/>
         <w:ind w:left="1260" w:leftChars="0" w:hanging="420" w:firstLineChars="0"/>
@@ -2512,7 +2670,7 @@
       <w:pPr>
         <w:numPr>
           <w:ilvl w:val="2"/>
-          <w:numId w:val="6"/>
+          <w:numId w:val="7"/>
         </w:numPr>
         <w:wordWrap/>
         <w:ind w:left="1260" w:leftChars="0" w:hanging="420" w:firstLineChars="0"/>
@@ -2590,7 +2748,7 @@
       <w:pPr>
         <w:numPr>
           <w:ilvl w:val="2"/>
-          <w:numId w:val="6"/>
+          <w:numId w:val="7"/>
         </w:numPr>
         <w:wordWrap/>
         <w:ind w:left="1260" w:leftChars="0" w:hanging="420" w:firstLineChars="0"/>
@@ -2626,7 +2784,7 @@
       <w:pPr>
         <w:numPr>
           <w:ilvl w:val="2"/>
-          <w:numId w:val="6"/>
+          <w:numId w:val="7"/>
         </w:numPr>
         <w:wordWrap/>
         <w:ind w:left="1260" w:leftChars="0" w:hanging="420" w:firstLineChars="0"/>
@@ -2638,68 +2796,25 @@
           <w:i w:val="0"/>
           <w:iCs w:val="0"/>
           <w:color w:val="auto"/>
-          <w:sz w:val="28"/>
-          <w:szCs w:val="28"/>
-          <w:lang w:val="en-US"/>
-        </w:rPr>
-      </w:pPr>
-      <w:r>
-        <w:rPr>
-          <w:rFonts w:hint="default" w:ascii="Arial" w:hAnsi="Arial" w:cs="Arial"/>
-          <w:b w:val="0"/>
-          <w:bCs w:val="0"/>
-          <w:i w:val="0"/>
-          <w:iCs w:val="0"/>
-          <w:color w:val="auto"/>
-          <w:sz w:val="28"/>
-          <w:szCs w:val="28"/>
-          <w:lang w:val="en-US"/>
-        </w:rPr>
-        <w:t>Served.</w:t>
-      </w:r>
-    </w:p>
-    <w:p>
-      <w:pPr>
-        <w:numPr>
-          <w:ilvl w:val="0"/>
-          <w:numId w:val="0"/>
-        </w:numPr>
-        <w:wordWrap/>
-        <w:ind w:leftChars="0"/>
-        <w:jc w:val="left"/>
-        <w:rPr>
-          <w:rFonts w:hint="default" w:ascii="Arial" w:hAnsi="Arial" w:cs="Arial"/>
-          <w:b w:val="0"/>
-          <w:bCs w:val="0"/>
-          <w:i w:val="0"/>
-          <w:iCs w:val="0"/>
-          <w:color w:val="auto"/>
-          <w:sz w:val="28"/>
-          <w:szCs w:val="28"/>
-          <w:lang w:val="en-US"/>
-        </w:rPr>
-      </w:pPr>
-    </w:p>
-    <w:p>
-      <w:pPr>
-        <w:numPr>
-          <w:ilvl w:val="0"/>
-          <w:numId w:val="0"/>
-        </w:numPr>
-        <w:wordWrap/>
-        <w:jc w:val="center"/>
-        <w:rPr>
-          <w:rFonts w:hint="default" w:ascii="Arial" w:hAnsi="Arial" w:cs="Arial"/>
-          <w:b w:val="0"/>
-          <w:bCs w:val="0"/>
-          <w:i w:val="0"/>
-          <w:iCs w:val="0"/>
-          <w:color w:val="auto"/>
           <w:sz w:val="56"/>
           <w:szCs w:val="56"/>
           <w:lang w:val="en-US"/>
         </w:rPr>
       </w:pPr>
+      <w:r>
+        <w:rPr>
+          <w:rFonts w:hint="default" w:ascii="Arial" w:hAnsi="Arial" w:cs="Arial"/>
+          <w:b w:val="0"/>
+          <w:bCs w:val="0"/>
+          <w:i w:val="0"/>
+          <w:iCs w:val="0"/>
+          <w:color w:val="auto"/>
+          <w:sz w:val="28"/>
+          <w:szCs w:val="28"/>
+          <w:lang w:val="en-US"/>
+        </w:rPr>
+        <w:t>Served.</w:t>
+      </w:r>
     </w:p>
     <w:p>
       <w:pPr>
@@ -2755,6 +2870,26 @@
     </w:lvl>
   </w:abstractNum>
   <w:abstractNum w:abstractNumId="1">
+    <w:nsid w:val="B1F040A2"/>
+    <w:multiLevelType w:val="singleLevel"/>
+    <w:tmpl w:val="B1F040A2"/>
+    <w:lvl w:ilvl="0" w:tentative="0">
+      <w:start w:val="1"/>
+      <w:numFmt w:val="bullet"/>
+      <w:lvlText w:val=""/>
+      <w:lvlJc w:val="left"/>
+      <w:pPr>
+        <w:tabs>
+          <w:tab w:val="left" w:pos="840"/>
+        </w:tabs>
+        <w:ind w:left="840" w:leftChars="0" w:hanging="420" w:firstLineChars="0"/>
+      </w:pPr>
+      <w:rPr>
+        <w:rFonts w:hint="default" w:ascii="Wingdings" w:hAnsi="Wingdings"/>
+      </w:rPr>
+    </w:lvl>
+  </w:abstractNum>
+  <w:abstractNum w:abstractNumId="2">
     <w:nsid w:val="BFD153E8"/>
     <w:multiLevelType w:val="multilevel"/>
     <w:tmpl w:val="BFD153E8"/>
@@ -2894,7 +3029,7 @@
       </w:rPr>
     </w:lvl>
   </w:abstractNum>
-  <w:abstractNum w:abstractNumId="2">
+  <w:abstractNum w:abstractNumId="3">
     <w:nsid w:val="EE22A597"/>
     <w:multiLevelType w:val="singleLevel"/>
     <w:tmpl w:val="EE22A597"/>
@@ -2914,7 +3049,7 @@
       </w:rPr>
     </w:lvl>
   </w:abstractNum>
-  <w:abstractNum w:abstractNumId="3">
+  <w:abstractNum w:abstractNumId="4">
     <w:nsid w:val="FF1F8E60"/>
     <w:multiLevelType w:val="multilevel"/>
     <w:tmpl w:val="FF1F8E60"/>
@@ -3054,7 +3189,7 @@
       </w:rPr>
     </w:lvl>
   </w:abstractNum>
-  <w:abstractNum w:abstractNumId="4">
+  <w:abstractNum w:abstractNumId="5">
     <w:nsid w:val="FF9C00AB"/>
     <w:multiLevelType w:val="multilevel"/>
     <w:tmpl w:val="FF9C00AB"/>
@@ -3194,7 +3329,7 @@
       </w:rPr>
     </w:lvl>
   </w:abstractNum>
-  <w:abstractNum w:abstractNumId="5">
+  <w:abstractNum w:abstractNumId="6">
     <w:nsid w:val="FFBA7125"/>
     <w:multiLevelType w:val="singleLevel"/>
     <w:tmpl w:val="FFBA7125"/>
@@ -3215,22 +3350,25 @@
     </w:lvl>
   </w:abstractNum>
   <w:num w:numId="1">
-    <w:abstractNumId w:val="4"/>
+    <w:abstractNumId w:val="5"/>
   </w:num>
   <w:num w:numId="2">
-    <w:abstractNumId w:val="5"/>
+    <w:abstractNumId w:val="6"/>
   </w:num>
   <w:num w:numId="3">
     <w:abstractNumId w:val="0"/>
   </w:num>
   <w:num w:numId="4">
-    <w:abstractNumId w:val="1"/>
+    <w:abstractNumId w:val="2"/>
   </w:num>
   <w:num w:numId="5">
-    <w:abstractNumId w:val="2"/>
+    <w:abstractNumId w:val="1"/>
   </w:num>
   <w:num w:numId="6">
     <w:abstractNumId w:val="3"/>
+  </w:num>
+  <w:num w:numId="7">
+    <w:abstractNumId w:val="4"/>
   </w:num>
 </w:numbering>
 </file>

</xml_diff>

<commit_message>
docs: Don't use "久陽乳乳酪機"
</commit_message>
<xml_diff>
--- a/400 Hong Kong Dollar Ingredients 2.docx
+++ b/400 Hong Kong Dollar Ingredients 2.docx
@@ -1775,6 +1775,7 @@
         <w:keepLines w:val="0"/>
         <w:widowControl/>
         <w:numPr>
+          <w:ilvl w:val="0"/>
           <w:numId w:val="0"/>
         </w:numPr>
         <w:suppressLineNumbers w:val="0"/>
@@ -1832,7 +1833,133 @@
           <w:szCs w:val="28"/>
           <w:lang w:val="en-US" w:eastAsia="zh-CN" w:bidi="ar-SA"/>
         </w:rPr>
-        <w:t>久陽優格機 product defect</w:t>
+        <w:t xml:space="preserve">久陽優格機 </w:t>
+      </w:r>
+      <w:r>
+        <w:rPr>
+          <w:rFonts w:hint="default" w:ascii="Arial" w:hAnsi="Arial" w:cs="Arial"/>
+          <w:b/>
+          <w:bCs/>
+          <w:i w:val="0"/>
+          <w:iCs w:val="0"/>
+          <w:color w:val="FF0000"/>
+          <w:sz w:val="28"/>
+          <w:szCs w:val="28"/>
+          <w:lang w:val="en-US" w:eastAsia="zh-CN" w:bidi="ar-SA"/>
+        </w:rPr>
+        <w:t xml:space="preserve">all related </w:t>
+      </w:r>
+      <w:r>
+        <w:rPr>
+          <w:rFonts w:hint="default" w:ascii="Arial" w:hAnsi="Arial" w:cs="Arial" w:eastAsiaTheme="minorEastAsia"/>
+          <w:b/>
+          <w:bCs/>
+          <w:i w:val="0"/>
+          <w:iCs w:val="0"/>
+          <w:color w:val="FF0000"/>
+          <w:sz w:val="28"/>
+          <w:szCs w:val="28"/>
+          <w:lang w:val="en-US" w:eastAsia="zh-CN" w:bidi="ar-SA"/>
+        </w:rPr>
+        <w:t>product</w:t>
+      </w:r>
+      <w:r>
+        <w:rPr>
+          <w:rFonts w:hint="default" w:ascii="Arial" w:hAnsi="Arial" w:cs="Arial"/>
+          <w:b/>
+          <w:bCs/>
+          <w:i w:val="0"/>
+          <w:iCs w:val="0"/>
+          <w:color w:val="FF0000"/>
+          <w:sz w:val="28"/>
+          <w:szCs w:val="28"/>
+          <w:lang w:val="en-US" w:eastAsia="zh-CN" w:bidi="ar-SA"/>
+        </w:rPr>
+        <w:t>s</w:t>
+      </w:r>
+      <w:r>
+        <w:rPr>
+          <w:rFonts w:hint="default" w:ascii="Arial" w:hAnsi="Arial" w:cs="Arial" w:eastAsiaTheme="minorEastAsia"/>
+          <w:b/>
+          <w:bCs/>
+          <w:i w:val="0"/>
+          <w:iCs w:val="0"/>
+          <w:color w:val="FF0000"/>
+          <w:sz w:val="28"/>
+          <w:szCs w:val="28"/>
+          <w:lang w:val="en-US" w:eastAsia="zh-CN" w:bidi="ar-SA"/>
+        </w:rPr>
+        <w:t xml:space="preserve"> </w:t>
+      </w:r>
+      <w:r>
+        <w:rPr>
+          <w:rFonts w:hint="default" w:ascii="Arial" w:hAnsi="Arial" w:cs="Arial"/>
+          <w:b/>
+          <w:bCs/>
+          <w:i w:val="0"/>
+          <w:iCs w:val="0"/>
+          <w:color w:val="FF0000"/>
+          <w:sz w:val="28"/>
+          <w:szCs w:val="28"/>
+          <w:lang w:val="en-US" w:eastAsia="zh-CN" w:bidi="ar-SA"/>
+        </w:rPr>
+        <w:t xml:space="preserve">due to </w:t>
+      </w:r>
+      <w:r>
+        <w:rPr>
+          <w:rFonts w:hint="default" w:ascii="Arial" w:hAnsi="Arial" w:cs="Arial"/>
+          <w:b/>
+          <w:bCs/>
+          <w:i w:val="0"/>
+          <w:iCs w:val="0"/>
+          <w:color w:val="FF0000"/>
+          <w:sz w:val="28"/>
+          <w:szCs w:val="28"/>
+          <w:lang w:val="en-US" w:eastAsia="zh-CN" w:bidi="ar-SA"/>
+        </w:rPr>
+        <w:tab/>
+      </w:r>
+      <w:r>
+        <w:rPr>
+          <w:rFonts w:hint="default" w:ascii="Arial" w:hAnsi="Arial" w:cs="Arial"/>
+          <w:b/>
+          <w:bCs/>
+          <w:i w:val="0"/>
+          <w:iCs w:val="0"/>
+          <w:color w:val="FF0000"/>
+          <w:sz w:val="28"/>
+          <w:szCs w:val="28"/>
+          <w:lang w:val="en-US" w:eastAsia="zh-CN" w:bidi="ar-SA"/>
+        </w:rPr>
+        <w:t xml:space="preserve"> </w:t>
+      </w:r>
+      <w:r>
+        <w:rPr>
+          <w:rFonts w:hint="default" w:ascii="Arial" w:hAnsi="Arial" w:cs="Arial" w:eastAsiaTheme="minorEastAsia"/>
+          <w:b/>
+          <w:bCs/>
+          <w:i w:val="0"/>
+          <w:iCs w:val="0"/>
+          <w:color w:val="FF0000"/>
+          <w:sz w:val="28"/>
+          <w:szCs w:val="28"/>
+          <w:lang w:val="en-US" w:eastAsia="zh-CN" w:bidi="ar-SA"/>
+        </w:rPr>
+        <w:t>defect</w:t>
+      </w:r>
+      <w:r>
+        <w:rPr>
+          <w:rFonts w:hint="default" w:ascii="Arial" w:hAnsi="Arial" w:cs="Arial"/>
+          <w:b/>
+          <w:bCs/>
+          <w:i w:val="0"/>
+          <w:iCs w:val="0"/>
+          <w:color w:val="FF0000"/>
+          <w:sz w:val="28"/>
+          <w:szCs w:val="28"/>
+          <w:lang w:val="en-US" w:eastAsia="zh-CN" w:bidi="ar-SA"/>
+        </w:rPr>
+        <w:t>s</w:t>
       </w:r>
       <w:r>
         <w:rPr>
@@ -1870,6 +1997,8 @@
           <w:lang w:val="en-US"/>
         </w:rPr>
       </w:pPr>
+      <w:bookmarkStart w:id="0" w:name="_GoBack"/>
+      <w:bookmarkEnd w:id="0"/>
       <w:r>
         <w:rPr>
           <w:rFonts w:hint="default" w:ascii="Arial" w:hAnsi="Arial" w:cs="Arial"/>
@@ -1977,8 +2106,6 @@
         </w:rPr>
         <w:t>Meat Raw ~ 81 gram</w:t>
       </w:r>
-      <w:bookmarkStart w:id="0" w:name="_GoBack"/>
-      <w:bookmarkEnd w:id="0"/>
     </w:p>
     <w:p>
       <w:pPr>
@@ -2395,7 +2522,120 @@
           <w:szCs w:val="28"/>
           <w:lang w:val="en-US" w:eastAsia="zh-CN" w:bidi="ar-SA"/>
         </w:rPr>
-        <w:t>久陽優格機 product defect</w:t>
+        <w:t xml:space="preserve">久陽優格機 </w:t>
+      </w:r>
+      <w:r>
+        <w:rPr>
+          <w:rFonts w:hint="default" w:ascii="Arial" w:hAnsi="Arial" w:cs="Arial"/>
+          <w:b/>
+          <w:bCs/>
+          <w:i w:val="0"/>
+          <w:iCs w:val="0"/>
+          <w:color w:val="FF0000"/>
+          <w:sz w:val="28"/>
+          <w:szCs w:val="28"/>
+          <w:lang w:val="en-US" w:eastAsia="zh-CN" w:bidi="ar-SA"/>
+        </w:rPr>
+        <w:t xml:space="preserve">all related </w:t>
+      </w:r>
+      <w:r>
+        <w:rPr>
+          <w:rFonts w:hint="default" w:ascii="Arial" w:hAnsi="Arial" w:cs="Arial" w:eastAsiaTheme="minorEastAsia"/>
+          <w:b/>
+          <w:bCs/>
+          <w:i w:val="0"/>
+          <w:iCs w:val="0"/>
+          <w:color w:val="FF0000"/>
+          <w:sz w:val="28"/>
+          <w:szCs w:val="28"/>
+          <w:lang w:val="en-US" w:eastAsia="zh-CN" w:bidi="ar-SA"/>
+        </w:rPr>
+        <w:t>product</w:t>
+      </w:r>
+      <w:r>
+        <w:rPr>
+          <w:rFonts w:hint="default" w:ascii="Arial" w:hAnsi="Arial" w:cs="Arial"/>
+          <w:b/>
+          <w:bCs/>
+          <w:i w:val="0"/>
+          <w:iCs w:val="0"/>
+          <w:color w:val="FF0000"/>
+          <w:sz w:val="28"/>
+          <w:szCs w:val="28"/>
+          <w:lang w:val="en-US" w:eastAsia="zh-CN" w:bidi="ar-SA"/>
+        </w:rPr>
+        <w:t>s</w:t>
+      </w:r>
+      <w:r>
+        <w:rPr>
+          <w:rFonts w:hint="default" w:ascii="Arial" w:hAnsi="Arial" w:cs="Arial" w:eastAsiaTheme="minorEastAsia"/>
+          <w:b/>
+          <w:bCs/>
+          <w:i w:val="0"/>
+          <w:iCs w:val="0"/>
+          <w:color w:val="FF0000"/>
+          <w:sz w:val="28"/>
+          <w:szCs w:val="28"/>
+          <w:lang w:val="en-US" w:eastAsia="zh-CN" w:bidi="ar-SA"/>
+        </w:rPr>
+        <w:t xml:space="preserve"> </w:t>
+      </w:r>
+      <w:r>
+        <w:rPr>
+          <w:rFonts w:hint="default" w:ascii="Arial" w:hAnsi="Arial" w:cs="Arial"/>
+          <w:b/>
+          <w:bCs/>
+          <w:i w:val="0"/>
+          <w:iCs w:val="0"/>
+          <w:color w:val="FF0000"/>
+          <w:sz w:val="28"/>
+          <w:szCs w:val="28"/>
+          <w:lang w:val="en-US" w:eastAsia="zh-CN" w:bidi="ar-SA"/>
+        </w:rPr>
+        <w:t xml:space="preserve">due to </w:t>
+      </w:r>
+      <w:r>
+        <w:rPr>
+          <w:rFonts w:hint="default" w:ascii="Arial" w:hAnsi="Arial" w:cs="Arial"/>
+          <w:b/>
+          <w:bCs/>
+          <w:i w:val="0"/>
+          <w:iCs w:val="0"/>
+          <w:color w:val="FF0000"/>
+          <w:sz w:val="28"/>
+          <w:szCs w:val="28"/>
+          <w:lang w:val="en-US" w:eastAsia="zh-CN" w:bidi="ar-SA"/>
+        </w:rPr>
+        <w:tab/>
+        <w:t xml:space="preserve"> </w:t>
+      </w:r>
+      <w:r>
+        <w:rPr>
+          <w:rFonts w:hint="default" w:ascii="Arial" w:hAnsi="Arial" w:cs="Arial" w:eastAsiaTheme="minorEastAsia"/>
+          <w:b/>
+          <w:bCs/>
+          <w:i w:val="0"/>
+          <w:iCs w:val="0"/>
+          <w:color w:val="FF0000"/>
+          <w:sz w:val="28"/>
+          <w:szCs w:val="28"/>
+          <w:lang w:val="en-US" w:eastAsia="zh-CN" w:bidi="ar-SA"/>
+        </w:rPr>
+        <w:t>defect</w:t>
+      </w:r>
+      <w:r>
+        <w:rPr>
+          <w:rFonts w:hint="default" w:ascii="Arial" w:hAnsi="Arial" w:cs="Arial"/>
+          <w:b/>
+          <w:bCs/>
+          <w:i w:val="0"/>
+          <w:iCs w:val="0"/>
+          <w:color w:val="FF0000"/>
+          <w:sz w:val="28"/>
+          <w:szCs w:val="28"/>
+          <w:lang w:val="en-US" w:eastAsia="zh-CN" w:bidi="ar-SA"/>
+        </w:rPr>
+        <w:t>s</w:t>
       </w:r>
       <w:r>
         <w:rPr>
@@ -2783,11 +3023,10 @@
     <w:p>
       <w:pPr>
         <w:numPr>
-          <w:ilvl w:val="2"/>
-          <w:numId w:val="7"/>
+          <w:ilvl w:val="0"/>
+          <w:numId w:val="0"/>
         </w:numPr>
         <w:wordWrap/>
-        <w:ind w:left="1260" w:leftChars="0" w:hanging="420" w:firstLineChars="0"/>
         <w:jc w:val="left"/>
         <w:rPr>
           <w:rFonts w:hint="default" w:ascii="Arial" w:hAnsi="Arial" w:cs="Arial"/>

</xml_diff>